<commit_message>
Added new documents, changed the model to 14b
</commit_message>
<xml_diff>
--- a/simulation/AI_Readiness_Simulation_Game_Plan.docx
+++ b/simulation/AI_Readiness_Simulation_Game_Plan.docx
@@ -1774,6 +1774,45 @@
     </w:p>
     <w:p>
       <w:pPr>
+        <w:pStyle w:val="ListBullet"/>
+      </w:pPr>
+      <w:r>
+        <w:rPr>
+          <w:b/>
+          <w:sz w:val="22"/>
+        </w:rPr>
+        <w:t>Resetting the Knowledge Base</w:t>
+      </w:r>
+      <w:r>
+        <w:rPr>
+          <w:sz w:val="22"/>
+        </w:rPr>
+        <w:t>: When input documents change (files added, removed, or reorganized), purge and rebuild the KB from scratch:</w:t>
+      </w:r>
+    </w:p>
+    <w:p>
+      <w:pPr>
+        <w:ind w:left="432"/>
+      </w:pPr>
+      <w:r>
+        <w:rPr>
+          <w:rFonts w:ascii="Consolas" w:hAnsi="Consolas"/>
+          <w:color w:val="282828"/>
+          <w:sz w:val="18"/>
+        </w:rPr>
+        <w:t xml:space="preserve">  python -m server.knowledge.ingest --reset</w:t>
+      </w:r>
+    </w:p>
+    <w:p>
+      <w:r>
+        <w:rPr>
+          <w:sz w:val="22"/>
+        </w:rPr>
+        <w:t>The `--reset` flag deletes all three ChromaDB collections (`kb_main`, `kb_framework`, `kb_decisions`), then re-ingests all documents from `InputDocs/` subfolders and reloads framework definitions from `dimensions.json`.</w:t>
+      </w:r>
+    </w:p>
+    <w:p>
+      <w:pPr>
         <w:pStyle w:val="Heading2"/>
       </w:pPr>
       <w:r>
@@ -2720,9 +2759,13 @@
         <w:br/>
         <w:t>│   │   ├── dimensions.py    # 13 dimension definitions, metric templates</w:t>
         <w:br/>
-        <w:t>│   │   └── InputDocs/       # Raw input documents (PDFs, reports, strategies)</w:t>
+        <w:t>│   │   └── InputDocs/       # Raw input documents</w:t>
         <w:br/>
-        <w:t>│   │       └── README.md    # Instructions for placing input documents</w:t>
+        <w:t>│   │       ├── Inputs.md    # Document manifest</w:t>
+        <w:br/>
+        <w:t>│   │       ├── AI_Strategies/  # National/regional AI strategies &amp; policies (23 files)</w:t>
+        <w:br/>
+        <w:t>│   │       └── AI_Use_Cases/   # ITU standards &amp; use-case references (1 file)</w:t>
         <w:br/>
         <w:t>│   ├── game/</w:t>
         <w:br/>

</xml_diff>